<commit_message>
Fix and update components/architecture
Updated DC1 and DC2 tables
Added missing current project structure
Adjusted architecture details
</commit_message>
<xml_diff>
--- a/docs/EEAI_CA1_ML.docx
+++ b/docs/EEAI_CA1_ML.docx
@@ -1840,7 +1840,7 @@
                 <w:lang w:eastAsia="en-GB"/>
                 <w14:ligatures w14:val="none"/>
               </w:rPr>
-              <w:t>Loads CSV, applies text cleaning, handles missing labels, builds chained targets (t2, t23, t234), splits train/test</w:t>
+              <w:t>Loads CSV, applies text cleaning, handles missing labels, and builds chained targets (t2, t23, t234)</w:t>
             </w:r>
           </w:p>
         </w:tc>
@@ -2814,7 +2814,7 @@
                 <w:lang w:eastAsia="en-GB"/>
                 <w14:ligatures w14:val="none"/>
               </w:rPr>
-              <w:t>Computes and prints accuracy for each chained target (t2, t23, t234)</w:t>
+              <w:t>Computes accuracy for each chained target (t2, t23, t234)</w:t>
             </w:r>
           </w:p>
         </w:tc>
@@ -2847,6 +2847,91 @@
                 <w14:ligatures w14:val="none"/>
               </w:rPr>
               <w:lastRenderedPageBreak/>
+              <w:t>src/evaluation/reporting.py</w:t>
+            </w:r>
+          </w:p>
+        </w:tc>
+        <w:tc>
+          <w:tcPr>
+            <w:tcW w:w="1984" w:type="dxa"/>
+            <w:shd w:val="clear" w:color="auto" w:fill="F2F2F2" w:themeFill="background1" w:themeFillShade="F2"/>
+          </w:tcPr>
+          <w:p>
+            <w:pPr>
+              <w:spacing w:before="240" w:after="240"/>
+              <w:rPr>
+                <w:rFonts w:ascii="Times New Roman" w:eastAsia="Times New Roman" w:hAnsi="Times New Roman" w:cs="Times New Roman"/>
+                <w:kern w:val="0"/>
+                <w:lang w:eastAsia="en-GB"/>
+                <w14:ligatures w14:val="none"/>
+              </w:rPr>
+            </w:pPr>
+            <w:r>
+              <w:rPr>
+                <w:rFonts w:ascii="Times New Roman" w:eastAsia="Times New Roman" w:hAnsi="Times New Roman" w:cs="Times New Roman"/>
+                <w:kern w:val="0"/>
+                <w:lang w:eastAsia="en-GB"/>
+                <w14:ligatures w14:val="none"/>
+              </w:rPr>
+              <w:t>Reporting</w:t>
+            </w:r>
+          </w:p>
+        </w:tc>
+        <w:tc>
+          <w:tcPr>
+            <w:tcW w:w="4961" w:type="dxa"/>
+            <w:shd w:val="clear" w:color="auto" w:fill="F2F2F2" w:themeFill="background1" w:themeFillShade="F2"/>
+          </w:tcPr>
+          <w:p>
+            <w:pPr>
+              <w:spacing w:before="240" w:after="240"/>
+              <w:jc w:val="both"/>
+              <w:rPr>
+                <w:rFonts w:ascii="Times New Roman" w:eastAsia="Times New Roman" w:hAnsi="Times New Roman" w:cs="Times New Roman"/>
+                <w:kern w:val="0"/>
+                <w:lang w:eastAsia="en-GB"/>
+                <w14:ligatures w14:val="none"/>
+              </w:rPr>
+            </w:pPr>
+            <w:r>
+              <w:rPr>
+                <w:rFonts w:ascii="Times New Roman" w:eastAsia="Times New Roman" w:hAnsi="Times New Roman" w:cs="Times New Roman"/>
+                <w:kern w:val="0"/>
+                <w:lang w:eastAsia="en-GB"/>
+                <w14:ligatures w14:val="none"/>
+              </w:rPr>
+              <w:t>Formats and prints the evaluation results returned by metrics.py</w:t>
+            </w:r>
+          </w:p>
+        </w:tc>
+      </w:tr>
+      <w:tr>
+        <w:trPr>
+          <w:trHeight w:hRule="exact" w:val="851"/>
+        </w:trPr>
+        <w:tc>
+          <w:tcPr>
+            <w:tcW w:w="4395" w:type="dxa"/>
+            <w:shd w:val="clear" w:color="auto" w:fill="F2F2F2" w:themeFill="background1" w:themeFillShade="F2"/>
+          </w:tcPr>
+          <w:p>
+            <w:pPr>
+              <w:spacing w:before="240" w:after="240"/>
+              <w:jc w:val="both"/>
+              <w:rPr>
+                <w:rFonts w:ascii="Times New Roman" w:eastAsia="Times New Roman" w:hAnsi="Times New Roman" w:cs="Times New Roman"/>
+                <w:kern w:val="0"/>
+                <w:lang w:eastAsia="en-GB"/>
+                <w14:ligatures w14:val="none"/>
+              </w:rPr>
+            </w:pPr>
+            <w:r>
+              <w:rPr>
+                <w:rFonts w:ascii="Times New Roman" w:eastAsia="Times New Roman" w:hAnsi="Times New Roman" w:cs="Times New Roman"/>
+                <w:kern w:val="0"/>
+                <w:lang w:eastAsia="en-GB"/>
+                <w14:ligatures w14:val="none"/>
+              </w:rPr>
               <w:t>tests/test_pipeline.py</w:t>
             </w:r>
           </w:p>
@@ -2901,7 +2986,179 @@
                 <w:lang w:eastAsia="en-GB"/>
                 <w14:ligatures w14:val="none"/>
               </w:rPr>
-              <w:t>Smoke test that runs the pipeline end to end and validates it completes successfully</w:t>
+              <w:t>Smoke test that verifies dataset loading, chained target creation, and train/test splitting</w:t>
+            </w:r>
+          </w:p>
+        </w:tc>
+      </w:tr>
+      <w:tr>
+        <w:trPr>
+          <w:trHeight w:hRule="exact" w:val="851"/>
+        </w:trPr>
+        <w:tc>
+          <w:tcPr>
+            <w:tcW w:w="4395" w:type="dxa"/>
+            <w:shd w:val="clear" w:color="auto" w:fill="F2F2F2" w:themeFill="background1" w:themeFillShade="F2"/>
+          </w:tcPr>
+          <w:p>
+            <w:pPr>
+              <w:spacing w:before="240" w:after="240"/>
+              <w:jc w:val="both"/>
+              <w:rPr>
+                <w:rFonts w:ascii="Times New Roman" w:eastAsia="Times New Roman" w:hAnsi="Times New Roman" w:cs="Times New Roman"/>
+                <w:kern w:val="0"/>
+                <w:lang w:eastAsia="en-GB"/>
+                <w14:ligatures w14:val="none"/>
+              </w:rPr>
+            </w:pPr>
+            <w:r>
+              <w:rPr>
+                <w:rFonts w:ascii="Times New Roman" w:eastAsia="Times New Roman" w:hAnsi="Times New Roman" w:cs="Times New Roman"/>
+                <w:kern w:val="0"/>
+                <w:lang w:eastAsia="en-GB"/>
+                <w14:ligatures w14:val="none"/>
+              </w:rPr>
+              <w:t>tests/test_model_predictions.py</w:t>
+            </w:r>
+          </w:p>
+        </w:tc>
+        <w:tc>
+          <w:tcPr>
+            <w:tcW w:w="1984" w:type="dxa"/>
+            <w:shd w:val="clear" w:color="auto" w:fill="F2F2F2" w:themeFill="background1" w:themeFillShade="F2"/>
+          </w:tcPr>
+          <w:p>
+            <w:pPr>
+              <w:spacing w:before="240" w:after="240"/>
+              <w:jc w:val="both"/>
+              <w:rPr>
+                <w:rFonts w:ascii="Times New Roman" w:eastAsia="Times New Roman" w:hAnsi="Times New Roman" w:cs="Times New Roman"/>
+                <w:kern w:val="0"/>
+                <w:lang w:eastAsia="en-GB"/>
+                <w14:ligatures w14:val="none"/>
+              </w:rPr>
+            </w:pPr>
+            <w:r>
+              <w:rPr>
+                <w:rFonts w:ascii="Times New Roman" w:eastAsia="Times New Roman" w:hAnsi="Times New Roman" w:cs="Times New Roman"/>
+                <w:kern w:val="0"/>
+                <w:lang w:eastAsia="en-GB"/>
+                <w14:ligatures w14:val="none"/>
+              </w:rPr>
+              <w:t>Testing</w:t>
+            </w:r>
+          </w:p>
+        </w:tc>
+        <w:tc>
+          <w:tcPr>
+            <w:tcW w:w="4961" w:type="dxa"/>
+            <w:shd w:val="clear" w:color="auto" w:fill="F2F2F2" w:themeFill="background1" w:themeFillShade="F2"/>
+          </w:tcPr>
+          <w:p>
+            <w:pPr>
+              <w:spacing w:before="240" w:after="240"/>
+              <w:jc w:val="both"/>
+              <w:rPr>
+                <w:rFonts w:ascii="Times New Roman" w:eastAsia="Times New Roman" w:hAnsi="Times New Roman" w:cs="Times New Roman"/>
+                <w:kern w:val="0"/>
+                <w:lang w:eastAsia="en-GB"/>
+                <w14:ligatures w14:val="none"/>
+              </w:rPr>
+            </w:pPr>
+            <w:r>
+              <w:rPr>
+                <w:rFonts w:ascii="Times New Roman" w:eastAsia="Times New Roman" w:hAnsi="Times New Roman" w:cs="Times New Roman"/>
+                <w:kern w:val="0"/>
+                <w:lang w:eastAsia="en-GB"/>
+                <w14:ligatures w14:val="none"/>
+              </w:rPr>
+              <w:t>Verifies that the selected model can train and predict t2, t23, and t234 outputs with the expected prediction keys and lengths</w:t>
+            </w:r>
+          </w:p>
+        </w:tc>
+      </w:tr>
+      <w:tr>
+        <w:trPr>
+          <w:trHeight w:hRule="exact" w:val="851"/>
+        </w:trPr>
+        <w:tc>
+          <w:tcPr>
+            <w:tcW w:w="4395" w:type="dxa"/>
+            <w:shd w:val="clear" w:color="auto" w:fill="F2F2F2" w:themeFill="background1" w:themeFillShade="F2"/>
+          </w:tcPr>
+          <w:p>
+            <w:pPr>
+              <w:spacing w:before="240" w:after="240"/>
+              <w:jc w:val="both"/>
+              <w:rPr>
+                <w:rFonts w:ascii="Times New Roman" w:eastAsia="Times New Roman" w:hAnsi="Times New Roman" w:cs="Times New Roman"/>
+                <w:kern w:val="0"/>
+                <w:lang w:eastAsia="en-GB"/>
+                <w14:ligatures w14:val="none"/>
+              </w:rPr>
+            </w:pPr>
+            <w:r>
+              <w:rPr>
+                <w:rFonts w:ascii="Times New Roman" w:eastAsia="Times New Roman" w:hAnsi="Times New Roman" w:cs="Times New Roman"/>
+                <w:kern w:val="0"/>
+                <w:lang w:eastAsia="en-GB"/>
+                <w14:ligatures w14:val="none"/>
+              </w:rPr>
+              <w:t>tests/test_targets.py</w:t>
+            </w:r>
+          </w:p>
+        </w:tc>
+        <w:tc>
+          <w:tcPr>
+            <w:tcW w:w="1984" w:type="dxa"/>
+            <w:shd w:val="clear" w:color="auto" w:fill="F2F2F2" w:themeFill="background1" w:themeFillShade="F2"/>
+          </w:tcPr>
+          <w:p>
+            <w:pPr>
+              <w:spacing w:before="240" w:after="240"/>
+              <w:jc w:val="both"/>
+              <w:rPr>
+                <w:rFonts w:ascii="Times New Roman" w:eastAsia="Times New Roman" w:hAnsi="Times New Roman" w:cs="Times New Roman"/>
+                <w:kern w:val="0"/>
+                <w:lang w:eastAsia="en-GB"/>
+                <w14:ligatures w14:val="none"/>
+              </w:rPr>
+            </w:pPr>
+            <w:r>
+              <w:rPr>
+                <w:rFonts w:ascii="Times New Roman" w:eastAsia="Times New Roman" w:hAnsi="Times New Roman" w:cs="Times New Roman"/>
+                <w:kern w:val="0"/>
+                <w:lang w:eastAsia="en-GB"/>
+                <w14:ligatures w14:val="none"/>
+              </w:rPr>
+              <w:t>Testing</w:t>
+            </w:r>
+          </w:p>
+        </w:tc>
+        <w:tc>
+          <w:tcPr>
+            <w:tcW w:w="4961" w:type="dxa"/>
+            <w:shd w:val="clear" w:color="auto" w:fill="F2F2F2" w:themeFill="background1" w:themeFillShade="F2"/>
+          </w:tcPr>
+          <w:p>
+            <w:pPr>
+              <w:spacing w:before="240" w:after="240"/>
+              <w:jc w:val="both"/>
+              <w:rPr>
+                <w:rFonts w:ascii="Times New Roman" w:eastAsia="Times New Roman" w:hAnsi="Times New Roman" w:cs="Times New Roman"/>
+                <w:kern w:val="0"/>
+                <w:lang w:eastAsia="en-GB"/>
+                <w14:ligatures w14:val="none"/>
+              </w:rPr>
+            </w:pPr>
+            <w:r>
+              <w:rPr>
+                <w:rFonts w:ascii="Times New Roman" w:eastAsia="Times New Roman" w:hAnsi="Times New Roman" w:cs="Times New Roman"/>
+                <w:kern w:val="0"/>
+                <w:lang w:eastAsia="en-GB"/>
+                <w14:ligatures w14:val="none"/>
+              </w:rPr>
+              <w:t>Verifies that chained targets target_t2, target_t23, and target_t234 are created correctly from the dataset</w:t>
             </w:r>
           </w:p>
         </w:tc>
@@ -3059,7 +3316,7 @@
                 <w:lang w:eastAsia="en-GB"/>
                 <w14:ligatures w14:val="none"/>
               </w:rPr>
-              <w:t>src/models/chained_multioutput_model.py</w:t>
+              <w:t>src/models/model_factory.py</w:t>
             </w:r>
           </w:p>
         </w:tc>
@@ -3113,16 +3370,7 @@
                 <w:lang w:eastAsia="en-GB"/>
                 <w14:ligatures w14:val="none"/>
               </w:rPr>
-              <w:t>R</w:t>
-            </w:r>
-            <w:r>
-              <w:rPr>
-                <w:rFonts w:ascii="Times New Roman" w:eastAsia="Times New Roman" w:hAnsi="Times New Roman" w:cs="Times New Roman"/>
-                <w:kern w:val="0"/>
-                <w:lang w:eastAsia="en-GB"/>
-                <w14:ligatures w14:val="none"/>
-              </w:rPr>
-              <w:t xml:space="preserve">eturns the appropriate </w:t>
+              <w:t xml:space="preserve">Returns the appropriate </w:t>
             </w:r>
             <w:proofErr w:type="spellStart"/>
             <w:r>
@@ -3190,10 +3438,11 @@
       <w:tr>
         <w:trPr>
           <w:trHeight w:hRule="exact" w:val="851"/>
+          <w:tblHeader/>
         </w:trPr>
         <w:tc>
           <w:tcPr>
-            <w:tcW w:w="1985" w:type="dxa"/>
+            <w:tcW w:w="1970" w:type="dxa"/>
             <w:shd w:val="clear" w:color="auto" w:fill="4670AB"/>
           </w:tcPr>
           <w:p>
@@ -3228,7 +3477,7 @@
         </w:tc>
         <w:tc>
           <w:tcPr>
-            <w:tcW w:w="2835" w:type="dxa"/>
+            <w:tcW w:w="2812" w:type="dxa"/>
             <w:shd w:val="clear" w:color="auto" w:fill="4670AB"/>
           </w:tcPr>
           <w:p>
@@ -3263,7 +3512,7 @@
         </w:tc>
         <w:tc>
           <w:tcPr>
-            <w:tcW w:w="1867" w:type="dxa"/>
+            <w:tcW w:w="1956" w:type="dxa"/>
             <w:shd w:val="clear" w:color="auto" w:fill="4670AB"/>
           </w:tcPr>
           <w:p>
@@ -3298,7 +3547,7 @@
         </w:tc>
         <w:tc>
           <w:tcPr>
-            <w:tcW w:w="4653" w:type="dxa"/>
+            <w:tcW w:w="4602" w:type="dxa"/>
             <w:shd w:val="clear" w:color="auto" w:fill="4670AB"/>
           </w:tcPr>
           <w:p>
@@ -3338,7 +3587,7 @@
         </w:trPr>
         <w:tc>
           <w:tcPr>
-            <w:tcW w:w="1985" w:type="dxa"/>
+            <w:tcW w:w="1970" w:type="dxa"/>
             <w:shd w:val="clear" w:color="auto" w:fill="F2F2F2" w:themeFill="background1" w:themeFillShade="F2"/>
           </w:tcPr>
           <w:p>
@@ -3365,7 +3614,7 @@
         </w:tc>
         <w:tc>
           <w:tcPr>
-            <w:tcW w:w="2835" w:type="dxa"/>
+            <w:tcW w:w="2812" w:type="dxa"/>
             <w:shd w:val="clear" w:color="auto" w:fill="F2F2F2" w:themeFill="background1" w:themeFillShade="F2"/>
           </w:tcPr>
           <w:p>
@@ -3392,7 +3641,7 @@
         </w:tc>
         <w:tc>
           <w:tcPr>
-            <w:tcW w:w="1867" w:type="dxa"/>
+            <w:tcW w:w="1956" w:type="dxa"/>
             <w:shd w:val="clear" w:color="auto" w:fill="F2F2F2" w:themeFill="background1" w:themeFillShade="F2"/>
           </w:tcPr>
           <w:p>
@@ -3419,7 +3668,7 @@
         </w:tc>
         <w:tc>
           <w:tcPr>
-            <w:tcW w:w="4653" w:type="dxa"/>
+            <w:tcW w:w="4602" w:type="dxa"/>
             <w:shd w:val="clear" w:color="auto" w:fill="F2F2F2" w:themeFill="background1" w:themeFillShade="F2"/>
           </w:tcPr>
           <w:p>
@@ -3450,7 +3699,17 @@
                 <w:lang w:eastAsia="en-GB"/>
                 <w14:ligatures w14:val="none"/>
               </w:rPr>
-              <w:t>load_dataset</w:t>
+              <w:t>load_</w:t>
+            </w:r>
+            <w:proofErr w:type="gramStart"/>
+            <w:r>
+              <w:rPr>
+                <w:rFonts w:ascii="Times New Roman" w:eastAsia="Times New Roman" w:hAnsi="Times New Roman" w:cs="Times New Roman"/>
+                <w:kern w:val="0"/>
+                <w:lang w:eastAsia="en-GB"/>
+                <w14:ligatures w14:val="none"/>
+              </w:rPr>
+              <w:t>dataset</w:t>
             </w:r>
             <w:proofErr w:type="spellEnd"/>
             <w:r>
@@ -3460,7 +3719,130 @@
                 <w:lang w:eastAsia="en-GB"/>
                 <w14:ligatures w14:val="none"/>
               </w:rPr>
-              <w:t xml:space="preserve">() and </w:t>
+              <w:t>(</w:t>
+            </w:r>
+            <w:proofErr w:type="gramEnd"/>
+            <w:r>
+              <w:rPr>
+                <w:rFonts w:ascii="Times New Roman" w:eastAsia="Times New Roman" w:hAnsi="Times New Roman" w:cs="Times New Roman"/>
+                <w:kern w:val="0"/>
+                <w:lang w:eastAsia="en-GB"/>
+                <w14:ligatures w14:val="none"/>
+              </w:rPr>
+              <w:t>) to read and prepare the data</w:t>
+            </w:r>
+          </w:p>
+        </w:tc>
+      </w:tr>
+      <w:tr>
+        <w:trPr>
+          <w:trHeight w:hRule="exact" w:val="1183"/>
+        </w:trPr>
+        <w:tc>
+          <w:tcPr>
+            <w:tcW w:w="1970" w:type="dxa"/>
+            <w:shd w:val="clear" w:color="auto" w:fill="F2F2F2" w:themeFill="background1" w:themeFillShade="F2"/>
+          </w:tcPr>
+          <w:p>
+            <w:pPr>
+              <w:spacing w:before="240" w:after="240"/>
+              <w:jc w:val="both"/>
+              <w:rPr>
+                <w:rFonts w:ascii="Times New Roman" w:eastAsia="Times New Roman" w:hAnsi="Times New Roman" w:cs="Times New Roman"/>
+                <w:kern w:val="0"/>
+                <w:lang w:eastAsia="en-GB"/>
+                <w14:ligatures w14:val="none"/>
+              </w:rPr>
+            </w:pPr>
+            <w:r>
+              <w:rPr>
+                <w:rFonts w:ascii="Times New Roman" w:eastAsia="Times New Roman" w:hAnsi="Times New Roman" w:cs="Times New Roman"/>
+                <w:kern w:val="0"/>
+                <w:lang w:eastAsia="en-GB"/>
+                <w14:ligatures w14:val="none"/>
+              </w:rPr>
+              <w:t>split dataset</w:t>
+            </w:r>
+          </w:p>
+        </w:tc>
+        <w:tc>
+          <w:tcPr>
+            <w:tcW w:w="2812" w:type="dxa"/>
+            <w:shd w:val="clear" w:color="auto" w:fill="F2F2F2" w:themeFill="background1" w:themeFillShade="F2"/>
+          </w:tcPr>
+          <w:p>
+            <w:pPr>
+              <w:spacing w:before="240" w:after="240"/>
+              <w:jc w:val="both"/>
+              <w:rPr>
+                <w:rFonts w:ascii="Times New Roman" w:eastAsia="Times New Roman" w:hAnsi="Times New Roman" w:cs="Times New Roman"/>
+                <w:kern w:val="0"/>
+                <w:lang w:eastAsia="en-GB"/>
+                <w14:ligatures w14:val="none"/>
+              </w:rPr>
+            </w:pPr>
+            <w:r>
+              <w:rPr>
+                <w:rFonts w:ascii="Times New Roman" w:eastAsia="Times New Roman" w:hAnsi="Times New Roman" w:cs="Times New Roman"/>
+                <w:kern w:val="0"/>
+                <w:lang w:eastAsia="en-GB"/>
+                <w14:ligatures w14:val="none"/>
+              </w:rPr>
+              <w:t>main_controller.py</w:t>
+            </w:r>
+          </w:p>
+        </w:tc>
+        <w:tc>
+          <w:tcPr>
+            <w:tcW w:w="1956" w:type="dxa"/>
+            <w:shd w:val="clear" w:color="auto" w:fill="F2F2F2" w:themeFill="background1" w:themeFillShade="F2"/>
+          </w:tcPr>
+          <w:p>
+            <w:pPr>
+              <w:spacing w:before="240" w:after="240"/>
+              <w:jc w:val="both"/>
+              <w:rPr>
+                <w:rFonts w:ascii="Times New Roman" w:eastAsia="Times New Roman" w:hAnsi="Times New Roman" w:cs="Times New Roman"/>
+                <w:kern w:val="0"/>
+                <w:lang w:eastAsia="en-GB"/>
+                <w14:ligatures w14:val="none"/>
+              </w:rPr>
+            </w:pPr>
+            <w:r>
+              <w:rPr>
+                <w:rFonts w:ascii="Times New Roman" w:eastAsia="Times New Roman" w:hAnsi="Times New Roman" w:cs="Times New Roman"/>
+                <w:kern w:val="0"/>
+                <w:lang w:eastAsia="en-GB"/>
+                <w14:ligatures w14:val="none"/>
+              </w:rPr>
+              <w:t>splitter.py</w:t>
+            </w:r>
+          </w:p>
+        </w:tc>
+        <w:tc>
+          <w:tcPr>
+            <w:tcW w:w="4602" w:type="dxa"/>
+            <w:shd w:val="clear" w:color="auto" w:fill="F2F2F2" w:themeFill="background1" w:themeFillShade="F2"/>
+          </w:tcPr>
+          <w:p>
+            <w:pPr>
+              <w:spacing w:before="240" w:after="240"/>
+              <w:jc w:val="both"/>
+              <w:rPr>
+                <w:rFonts w:ascii="Times New Roman" w:eastAsia="Times New Roman" w:hAnsi="Times New Roman" w:cs="Times New Roman"/>
+                <w:kern w:val="0"/>
+                <w:lang w:eastAsia="en-GB"/>
+                <w14:ligatures w14:val="none"/>
+              </w:rPr>
+            </w:pPr>
+            <w:r>
+              <w:rPr>
+                <w:rFonts w:ascii="Times New Roman" w:eastAsia="Times New Roman" w:hAnsi="Times New Roman" w:cs="Times New Roman"/>
+                <w:kern w:val="0"/>
+                <w:lang w:eastAsia="en-GB"/>
+                <w14:ligatures w14:val="none"/>
+              </w:rPr>
+              <w:t xml:space="preserve">Controller calls </w:t>
             </w:r>
             <w:proofErr w:type="spellStart"/>
             <w:r>
@@ -3470,7 +3852,17 @@
                 <w:lang w:eastAsia="en-GB"/>
                 <w14:ligatures w14:val="none"/>
               </w:rPr>
-              <w:t>split_dataset</w:t>
+              <w:t>split_</w:t>
+            </w:r>
+            <w:proofErr w:type="gramStart"/>
+            <w:r>
+              <w:rPr>
+                <w:rFonts w:ascii="Times New Roman" w:eastAsia="Times New Roman" w:hAnsi="Times New Roman" w:cs="Times New Roman"/>
+                <w:kern w:val="0"/>
+                <w:lang w:eastAsia="en-GB"/>
+                <w14:ligatures w14:val="none"/>
+              </w:rPr>
+              <w:t>dataset</w:t>
             </w:r>
             <w:proofErr w:type="spellEnd"/>
             <w:r>
@@ -3480,7 +3872,17 @@
                 <w:lang w:eastAsia="en-GB"/>
                 <w14:ligatures w14:val="none"/>
               </w:rPr>
-              <w:t>() to read and prepare the data</w:t>
+              <w:t>(</w:t>
+            </w:r>
+            <w:proofErr w:type="gramEnd"/>
+            <w:r>
+              <w:rPr>
+                <w:rFonts w:ascii="Times New Roman" w:eastAsia="Times New Roman" w:hAnsi="Times New Roman" w:cs="Times New Roman"/>
+                <w:kern w:val="0"/>
+                <w:lang w:eastAsia="en-GB"/>
+                <w14:ligatures w14:val="none"/>
+              </w:rPr>
+              <w:t>) to create stratified training and test sets based on Type 2 labels</w:t>
             </w:r>
           </w:p>
         </w:tc>
@@ -3491,7 +3893,7 @@
         </w:trPr>
         <w:tc>
           <w:tcPr>
-            <w:tcW w:w="1985" w:type="dxa"/>
+            <w:tcW w:w="1970" w:type="dxa"/>
             <w:shd w:val="clear" w:color="auto" w:fill="F2F2F2" w:themeFill="background1" w:themeFillShade="F2"/>
           </w:tcPr>
           <w:p>
@@ -3518,7 +3920,7 @@
         </w:tc>
         <w:tc>
           <w:tcPr>
-            <w:tcW w:w="2835" w:type="dxa"/>
+            <w:tcW w:w="2812" w:type="dxa"/>
             <w:shd w:val="clear" w:color="auto" w:fill="F2F2F2" w:themeFill="background1" w:themeFillShade="F2"/>
           </w:tcPr>
           <w:p>
@@ -3545,7 +3947,7 @@
         </w:tc>
         <w:tc>
           <w:tcPr>
-            <w:tcW w:w="1867" w:type="dxa"/>
+            <w:tcW w:w="1956" w:type="dxa"/>
             <w:shd w:val="clear" w:color="auto" w:fill="F2F2F2" w:themeFill="background1" w:themeFillShade="F2"/>
           </w:tcPr>
           <w:p>
@@ -3572,7 +3974,7 @@
         </w:tc>
         <w:tc>
           <w:tcPr>
-            <w:tcW w:w="4653" w:type="dxa"/>
+            <w:tcW w:w="4602" w:type="dxa"/>
             <w:shd w:val="clear" w:color="auto" w:fill="F2F2F2" w:themeFill="background1" w:themeFillShade="F2"/>
           </w:tcPr>
           <w:p>
@@ -3603,7 +4005,17 @@
                 <w:lang w:eastAsia="en-GB"/>
                 <w14:ligatures w14:val="none"/>
               </w:rPr>
-              <w:t>clean_text</w:t>
+              <w:t>clean_</w:t>
+            </w:r>
+            <w:proofErr w:type="gramStart"/>
+            <w:r>
+              <w:rPr>
+                <w:rFonts w:ascii="Times New Roman" w:eastAsia="Times New Roman" w:hAnsi="Times New Roman" w:cs="Times New Roman"/>
+                <w:kern w:val="0"/>
+                <w:lang w:eastAsia="en-GB"/>
+                <w14:ligatures w14:val="none"/>
+              </w:rPr>
+              <w:t>text</w:t>
             </w:r>
             <w:proofErr w:type="spellEnd"/>
             <w:r>
@@ -3613,7 +4025,17 @@
                 <w:lang w:eastAsia="en-GB"/>
                 <w14:ligatures w14:val="none"/>
               </w:rPr>
-              <w:t>() to normalize raw email text</w:t>
+              <w:t>(</w:t>
+            </w:r>
+            <w:proofErr w:type="gramEnd"/>
+            <w:r>
+              <w:rPr>
+                <w:rFonts w:ascii="Times New Roman" w:eastAsia="Times New Roman" w:hAnsi="Times New Roman" w:cs="Times New Roman"/>
+                <w:kern w:val="0"/>
+                <w:lang w:eastAsia="en-GB"/>
+                <w14:ligatures w14:val="none"/>
+              </w:rPr>
+              <w:t>) to normalize raw email text</w:t>
             </w:r>
           </w:p>
         </w:tc>
@@ -3624,7 +4046,7 @@
         </w:trPr>
         <w:tc>
           <w:tcPr>
-            <w:tcW w:w="1985" w:type="dxa"/>
+            <w:tcW w:w="1970" w:type="dxa"/>
             <w:shd w:val="clear" w:color="auto" w:fill="F2F2F2" w:themeFill="background1" w:themeFillShade="F2"/>
           </w:tcPr>
           <w:p>
@@ -3651,7 +4073,7 @@
         </w:tc>
         <w:tc>
           <w:tcPr>
-            <w:tcW w:w="2835" w:type="dxa"/>
+            <w:tcW w:w="2812" w:type="dxa"/>
             <w:shd w:val="clear" w:color="auto" w:fill="F2F2F2" w:themeFill="background1" w:themeFillShade="F2"/>
           </w:tcPr>
           <w:p>
@@ -3678,7 +4100,7 @@
         </w:tc>
         <w:tc>
           <w:tcPr>
-            <w:tcW w:w="1867" w:type="dxa"/>
+            <w:tcW w:w="1956" w:type="dxa"/>
             <w:shd w:val="clear" w:color="auto" w:fill="F2F2F2" w:themeFill="background1" w:themeFillShade="F2"/>
           </w:tcPr>
           <w:p>
@@ -3705,7 +4127,7 @@
         </w:tc>
         <w:tc>
           <w:tcPr>
-            <w:tcW w:w="4653" w:type="dxa"/>
+            <w:tcW w:w="4602" w:type="dxa"/>
             <w:shd w:val="clear" w:color="auto" w:fill="F2F2F2" w:themeFill="background1" w:themeFillShade="F2"/>
           </w:tcPr>
           <w:p>
@@ -3736,7 +4158,17 @@
                 <w:lang w:eastAsia="en-GB"/>
                 <w14:ligatures w14:val="none"/>
               </w:rPr>
-              <w:t>vectorize_text</w:t>
+              <w:t>vectorize_</w:t>
+            </w:r>
+            <w:proofErr w:type="gramStart"/>
+            <w:r>
+              <w:rPr>
+                <w:rFonts w:ascii="Times New Roman" w:eastAsia="Times New Roman" w:hAnsi="Times New Roman" w:cs="Times New Roman"/>
+                <w:kern w:val="0"/>
+                <w:lang w:eastAsia="en-GB"/>
+                <w14:ligatures w14:val="none"/>
+              </w:rPr>
+              <w:t>text</w:t>
             </w:r>
             <w:proofErr w:type="spellEnd"/>
             <w:r>
@@ -3746,7 +4178,17 @@
                 <w:lang w:eastAsia="en-GB"/>
                 <w14:ligatures w14:val="none"/>
               </w:rPr>
-              <w:t>() to fit on training text and transform train/test sets</w:t>
+              <w:t>(</w:t>
+            </w:r>
+            <w:proofErr w:type="gramEnd"/>
+            <w:r>
+              <w:rPr>
+                <w:rFonts w:ascii="Times New Roman" w:eastAsia="Times New Roman" w:hAnsi="Times New Roman" w:cs="Times New Roman"/>
+                <w:kern w:val="0"/>
+                <w:lang w:eastAsia="en-GB"/>
+                <w14:ligatures w14:val="none"/>
+              </w:rPr>
+              <w:t>) to fit on training text and transform train/test sets</w:t>
             </w:r>
           </w:p>
         </w:tc>
@@ -3757,7 +4199,7 @@
         </w:trPr>
         <w:tc>
           <w:tcPr>
-            <w:tcW w:w="1985" w:type="dxa"/>
+            <w:tcW w:w="1970" w:type="dxa"/>
             <w:shd w:val="clear" w:color="auto" w:fill="F2F2F2" w:themeFill="background1" w:themeFillShade="F2"/>
           </w:tcPr>
           <w:p>
@@ -3784,7 +4226,7 @@
         </w:tc>
         <w:tc>
           <w:tcPr>
-            <w:tcW w:w="2835" w:type="dxa"/>
+            <w:tcW w:w="2812" w:type="dxa"/>
             <w:shd w:val="clear" w:color="auto" w:fill="F2F2F2" w:themeFill="background1" w:themeFillShade="F2"/>
           </w:tcPr>
           <w:p>
@@ -3811,7 +4253,7 @@
         </w:tc>
         <w:tc>
           <w:tcPr>
-            <w:tcW w:w="1867" w:type="dxa"/>
+            <w:tcW w:w="1956" w:type="dxa"/>
             <w:shd w:val="clear" w:color="auto" w:fill="F2F2F2" w:themeFill="background1" w:themeFillShade="F2"/>
           </w:tcPr>
           <w:p>
@@ -3838,7 +4280,7 @@
         </w:tc>
         <w:tc>
           <w:tcPr>
-            <w:tcW w:w="4653" w:type="dxa"/>
+            <w:tcW w:w="4602" w:type="dxa"/>
             <w:shd w:val="clear" w:color="auto" w:fill="F2F2F2" w:themeFill="background1" w:themeFillShade="F2"/>
           </w:tcPr>
           <w:p>
@@ -3890,34 +4332,35 @@
         </w:trPr>
         <w:tc>
           <w:tcPr>
-            <w:tcW w:w="1985" w:type="dxa"/>
-            <w:shd w:val="clear" w:color="auto" w:fill="F2F2F2" w:themeFill="background1" w:themeFillShade="F2"/>
-          </w:tcPr>
-          <w:p>
-            <w:pPr>
-              <w:spacing w:before="240" w:after="240"/>
-              <w:jc w:val="both"/>
-              <w:rPr>
-                <w:rFonts w:ascii="Times New Roman" w:eastAsia="Times New Roman" w:hAnsi="Times New Roman" w:cs="Times New Roman"/>
-                <w:kern w:val="0"/>
-                <w:lang w:eastAsia="en-GB"/>
-                <w14:ligatures w14:val="none"/>
-              </w:rPr>
-            </w:pPr>
-            <w:r>
-              <w:rPr>
-                <w:rFonts w:ascii="Times New Roman" w:eastAsia="Times New Roman" w:hAnsi="Times New Roman" w:cs="Times New Roman"/>
-                <w:kern w:val="0"/>
-                <w:lang w:eastAsia="en-GB"/>
-                <w14:ligatures w14:val="none"/>
-              </w:rPr>
+            <w:tcW w:w="1970" w:type="dxa"/>
+            <w:shd w:val="clear" w:color="auto" w:fill="F2F2F2" w:themeFill="background1" w:themeFillShade="F2"/>
+          </w:tcPr>
+          <w:p>
+            <w:pPr>
+              <w:spacing w:before="240" w:after="240"/>
+              <w:jc w:val="both"/>
+              <w:rPr>
+                <w:rFonts w:ascii="Times New Roman" w:eastAsia="Times New Roman" w:hAnsi="Times New Roman" w:cs="Times New Roman"/>
+                <w:kern w:val="0"/>
+                <w:lang w:eastAsia="en-GB"/>
+                <w14:ligatures w14:val="none"/>
+              </w:rPr>
+            </w:pPr>
+            <w:r>
+              <w:rPr>
+                <w:rFonts w:ascii="Times New Roman" w:eastAsia="Times New Roman" w:hAnsi="Times New Roman" w:cs="Times New Roman"/>
+                <w:kern w:val="0"/>
+                <w:lang w:eastAsia="en-GB"/>
+                <w14:ligatures w14:val="none"/>
+              </w:rPr>
+              <w:lastRenderedPageBreak/>
               <w:t>train and predict</w:t>
             </w:r>
           </w:p>
         </w:tc>
         <w:tc>
           <w:tcPr>
-            <w:tcW w:w="2835" w:type="dxa"/>
+            <w:tcW w:w="2812" w:type="dxa"/>
             <w:shd w:val="clear" w:color="auto" w:fill="F2F2F2" w:themeFill="background1" w:themeFillShade="F2"/>
           </w:tcPr>
           <w:p>
@@ -3944,7 +4387,7 @@
         </w:tc>
         <w:tc>
           <w:tcPr>
-            <w:tcW w:w="1867" w:type="dxa"/>
+            <w:tcW w:w="1956" w:type="dxa"/>
             <w:shd w:val="clear" w:color="auto" w:fill="F2F2F2" w:themeFill="background1" w:themeFillShade="F2"/>
           </w:tcPr>
           <w:p>
@@ -3971,7 +4414,7 @@
         </w:tc>
         <w:tc>
           <w:tcPr>
-            <w:tcW w:w="4653" w:type="dxa"/>
+            <w:tcW w:w="4602" w:type="dxa"/>
             <w:shd w:val="clear" w:color="auto" w:fill="F2F2F2" w:themeFill="background1" w:themeFillShade="F2"/>
           </w:tcPr>
           <w:p>
@@ -4002,7 +4445,17 @@
                 <w:lang w:eastAsia="en-GB"/>
                 <w14:ligatures w14:val="none"/>
               </w:rPr>
-              <w:t>get_model</w:t>
+              <w:t>get_</w:t>
+            </w:r>
+            <w:proofErr w:type="gramStart"/>
+            <w:r>
+              <w:rPr>
+                <w:rFonts w:ascii="Times New Roman" w:eastAsia="Times New Roman" w:hAnsi="Times New Roman" w:cs="Times New Roman"/>
+                <w:kern w:val="0"/>
+                <w:lang w:eastAsia="en-GB"/>
+                <w14:ligatures w14:val="none"/>
+              </w:rPr>
+              <w:t>model</w:t>
             </w:r>
             <w:proofErr w:type="spellEnd"/>
             <w:r>
@@ -4012,7 +4465,17 @@
                 <w:lang w:eastAsia="en-GB"/>
                 <w14:ligatures w14:val="none"/>
               </w:rPr>
-              <w:t xml:space="preserve">() from model_factory.py which returns the appropriate </w:t>
+              <w:t>(</w:t>
+            </w:r>
+            <w:proofErr w:type="gramEnd"/>
+            <w:r>
+              <w:rPr>
+                <w:rFonts w:ascii="Times New Roman" w:eastAsia="Times New Roman" w:hAnsi="Times New Roman" w:cs="Times New Roman"/>
+                <w:kern w:val="0"/>
+                <w:lang w:eastAsia="en-GB"/>
+                <w14:ligatures w14:val="none"/>
+              </w:rPr>
+              <w:t xml:space="preserve">) from model_factory.py which returns the appropriate </w:t>
             </w:r>
             <w:proofErr w:type="spellStart"/>
             <w:r>
@@ -4103,7 +4566,7 @@
         </w:trPr>
         <w:tc>
           <w:tcPr>
-            <w:tcW w:w="1985" w:type="dxa"/>
+            <w:tcW w:w="1970" w:type="dxa"/>
             <w:shd w:val="clear" w:color="auto" w:fill="F2F2F2" w:themeFill="background1" w:themeFillShade="F2"/>
           </w:tcPr>
           <w:p>
@@ -4130,7 +4593,7 @@
         </w:tc>
         <w:tc>
           <w:tcPr>
-            <w:tcW w:w="2835" w:type="dxa"/>
+            <w:tcW w:w="2812" w:type="dxa"/>
             <w:shd w:val="clear" w:color="auto" w:fill="F2F2F2" w:themeFill="background1" w:themeFillShade="F2"/>
           </w:tcPr>
           <w:p>
@@ -4166,7 +4629,7 @@
         </w:tc>
         <w:tc>
           <w:tcPr>
-            <w:tcW w:w="1867" w:type="dxa"/>
+            <w:tcW w:w="1956" w:type="dxa"/>
             <w:shd w:val="clear" w:color="auto" w:fill="F2F2F2" w:themeFill="background1" w:themeFillShade="F2"/>
           </w:tcPr>
           <w:p>
@@ -4193,7 +4656,7 @@
         </w:tc>
         <w:tc>
           <w:tcPr>
-            <w:tcW w:w="4653" w:type="dxa"/>
+            <w:tcW w:w="4602" w:type="dxa"/>
             <w:shd w:val="clear" w:color="auto" w:fill="F2F2F2" w:themeFill="background1" w:themeFillShade="F2"/>
           </w:tcPr>
           <w:p>
@@ -4224,7 +4687,17 @@
                 <w:lang w:eastAsia="en-GB"/>
                 <w14:ligatures w14:val="none"/>
               </w:rPr>
-              <w:t>evaluate_predictions</w:t>
+              <w:t>evaluate_</w:t>
+            </w:r>
+            <w:proofErr w:type="gramStart"/>
+            <w:r>
+              <w:rPr>
+                <w:rFonts w:ascii="Times New Roman" w:eastAsia="Times New Roman" w:hAnsi="Times New Roman" w:cs="Times New Roman"/>
+                <w:kern w:val="0"/>
+                <w:lang w:eastAsia="en-GB"/>
+                <w14:ligatures w14:val="none"/>
+              </w:rPr>
+              <w:t>predictions</w:t>
             </w:r>
             <w:proofErr w:type="spellEnd"/>
             <w:r>
@@ -4234,7 +4707,17 @@
                 <w:lang w:eastAsia="en-GB"/>
                 <w14:ligatures w14:val="none"/>
               </w:rPr>
-              <w:t>()</w:t>
+              <w:t>(</w:t>
+            </w:r>
+            <w:proofErr w:type="gramEnd"/>
+            <w:r>
+              <w:rPr>
+                <w:rFonts w:ascii="Times New Roman" w:eastAsia="Times New Roman" w:hAnsi="Times New Roman" w:cs="Times New Roman"/>
+                <w:kern w:val="0"/>
+                <w:lang w:eastAsia="en-GB"/>
+                <w14:ligatures w14:val="none"/>
+              </w:rPr>
+              <w:t>)</w:t>
             </w:r>
           </w:p>
         </w:tc>
@@ -4245,7 +4728,7 @@
         </w:trPr>
         <w:tc>
           <w:tcPr>
-            <w:tcW w:w="1985" w:type="dxa"/>
+            <w:tcW w:w="1970" w:type="dxa"/>
             <w:shd w:val="clear" w:color="auto" w:fill="F2F2F2" w:themeFill="background1" w:themeFillShade="F2"/>
           </w:tcPr>
           <w:p>
@@ -4272,7 +4755,7 @@
         </w:tc>
         <w:tc>
           <w:tcPr>
-            <w:tcW w:w="2835" w:type="dxa"/>
+            <w:tcW w:w="2812" w:type="dxa"/>
             <w:shd w:val="clear" w:color="auto" w:fill="F2F2F2" w:themeFill="background1" w:themeFillShade="F2"/>
           </w:tcPr>
           <w:p>
@@ -4299,7 +4782,7 @@
         </w:tc>
         <w:tc>
           <w:tcPr>
-            <w:tcW w:w="1867" w:type="dxa"/>
+            <w:tcW w:w="1956" w:type="dxa"/>
             <w:shd w:val="clear" w:color="auto" w:fill="F2F2F2" w:themeFill="background1" w:themeFillShade="F2"/>
           </w:tcPr>
           <w:p>
@@ -4326,7 +4809,7 @@
         </w:tc>
         <w:tc>
           <w:tcPr>
-            <w:tcW w:w="4653" w:type="dxa"/>
+            <w:tcW w:w="4602" w:type="dxa"/>
             <w:shd w:val="clear" w:color="auto" w:fill="F2F2F2" w:themeFill="background1" w:themeFillShade="F2"/>
           </w:tcPr>
           <w:p>
@@ -4357,7 +4840,17 @@
                 <w:lang w:eastAsia="en-GB"/>
                 <w14:ligatures w14:val="none"/>
               </w:rPr>
-              <w:t>print_evaluation</w:t>
+              <w:t>print_</w:t>
+            </w:r>
+            <w:proofErr w:type="gramStart"/>
+            <w:r>
+              <w:rPr>
+                <w:rFonts w:ascii="Times New Roman" w:eastAsia="Times New Roman" w:hAnsi="Times New Roman" w:cs="Times New Roman"/>
+                <w:kern w:val="0"/>
+                <w:lang w:eastAsia="en-GB"/>
+                <w14:ligatures w14:val="none"/>
+              </w:rPr>
+              <w:t>evaluation</w:t>
             </w:r>
             <w:proofErr w:type="spellEnd"/>
             <w:r>
@@ -4367,18 +4860,28 @@
                 <w:lang w:eastAsia="en-GB"/>
                 <w14:ligatures w14:val="none"/>
               </w:rPr>
-              <w:t>() in reporting.py which formats and prints them to the console</w:t>
+              <w:t>(</w:t>
+            </w:r>
+            <w:proofErr w:type="gramEnd"/>
+            <w:r>
+              <w:rPr>
+                <w:rFonts w:ascii="Times New Roman" w:eastAsia="Times New Roman" w:hAnsi="Times New Roman" w:cs="Times New Roman"/>
+                <w:kern w:val="0"/>
+                <w:lang w:eastAsia="en-GB"/>
+                <w14:ligatures w14:val="none"/>
+              </w:rPr>
+              <w:t>) in reporting.py which formats and prints them to the console</w:t>
             </w:r>
           </w:p>
         </w:tc>
       </w:tr>
       <w:tr>
         <w:trPr>
-          <w:trHeight w:hRule="exact" w:val="851"/>
+          <w:trHeight w:hRule="exact" w:val="1100"/>
         </w:trPr>
         <w:tc>
           <w:tcPr>
-            <w:tcW w:w="1985" w:type="dxa"/>
+            <w:tcW w:w="1970" w:type="dxa"/>
             <w:shd w:val="clear" w:color="auto" w:fill="F2F2F2" w:themeFill="background1" w:themeFillShade="F2"/>
           </w:tcPr>
           <w:p>
@@ -4405,7 +4908,7 @@
         </w:tc>
         <w:tc>
           <w:tcPr>
-            <w:tcW w:w="2835" w:type="dxa"/>
+            <w:tcW w:w="2812" w:type="dxa"/>
             <w:shd w:val="clear" w:color="auto" w:fill="F2F2F2" w:themeFill="background1" w:themeFillShade="F2"/>
           </w:tcPr>
           <w:p>
@@ -4432,7 +4935,7 @@
         </w:tc>
         <w:tc>
           <w:tcPr>
-            <w:tcW w:w="1867" w:type="dxa"/>
+            <w:tcW w:w="1956" w:type="dxa"/>
             <w:shd w:val="clear" w:color="auto" w:fill="F2F2F2" w:themeFill="background1" w:themeFillShade="F2"/>
           </w:tcPr>
           <w:p>
@@ -4459,28 +4962,28 @@
         </w:tc>
         <w:tc>
           <w:tcPr>
-            <w:tcW w:w="4653" w:type="dxa"/>
-            <w:shd w:val="clear" w:color="auto" w:fill="F2F2F2" w:themeFill="background1" w:themeFillShade="F2"/>
-          </w:tcPr>
-          <w:p>
-            <w:pPr>
-              <w:spacing w:before="240" w:after="240"/>
-              <w:jc w:val="both"/>
-              <w:rPr>
-                <w:rFonts w:ascii="Times New Roman" w:eastAsia="Times New Roman" w:hAnsi="Times New Roman" w:cs="Times New Roman"/>
-                <w:kern w:val="0"/>
-                <w:lang w:eastAsia="en-GB"/>
-                <w14:ligatures w14:val="none"/>
-              </w:rPr>
-            </w:pPr>
-            <w:r>
-              <w:rPr>
-                <w:rFonts w:ascii="Times New Roman" w:eastAsia="Times New Roman" w:hAnsi="Times New Roman" w:cs="Times New Roman"/>
-                <w:kern w:val="0"/>
-                <w:lang w:eastAsia="en-GB"/>
-                <w14:ligatures w14:val="none"/>
-              </w:rPr>
-              <w:t>Smoke test executes the pipeline and checks it runs without errors</w:t>
+            <w:tcW w:w="4602" w:type="dxa"/>
+            <w:shd w:val="clear" w:color="auto" w:fill="F2F2F2" w:themeFill="background1" w:themeFillShade="F2"/>
+          </w:tcPr>
+          <w:p>
+            <w:pPr>
+              <w:spacing w:before="240" w:after="240"/>
+              <w:jc w:val="both"/>
+              <w:rPr>
+                <w:rFonts w:ascii="Times New Roman" w:eastAsia="Times New Roman" w:hAnsi="Times New Roman" w:cs="Times New Roman"/>
+                <w:kern w:val="0"/>
+                <w:lang w:eastAsia="en-GB"/>
+                <w14:ligatures w14:val="none"/>
+              </w:rPr>
+            </w:pPr>
+            <w:r>
+              <w:rPr>
+                <w:rFonts w:ascii="Times New Roman" w:eastAsia="Times New Roman" w:hAnsi="Times New Roman" w:cs="Times New Roman"/>
+                <w:kern w:val="0"/>
+                <w:lang w:eastAsia="en-GB"/>
+                <w14:ligatures w14:val="none"/>
+              </w:rPr>
+              <w:t>Smoke test checks dataset loading, chained target creation, and train/test splitting in the base pipeline</w:t>
             </w:r>
           </w:p>
         </w:tc>
@@ -4518,7 +5021,6 @@
           <w:lang w:eastAsia="en-GB"/>
           <w14:ligatures w14:val="none"/>
         </w:rPr>
-        <w:lastRenderedPageBreak/>
         <w:t xml:space="preserve">Data </w:t>
       </w:r>
       <w:r>
@@ -5217,6 +5719,7 @@
                 <w:lang w:eastAsia="en-GB"/>
                 <w14:ligatures w14:val="none"/>
               </w:rPr>
+              <w:lastRenderedPageBreak/>
               <w:t>X_train_vec</w:t>
             </w:r>
             <w:proofErr w:type="spellEnd"/>
@@ -5881,7 +6384,6 @@
           <w:lang w:eastAsia="en-GB"/>
           <w14:ligatures w14:val="none"/>
         </w:rPr>
-        <w:lastRenderedPageBreak/>
         <w:t xml:space="preserve">Design Choice 2 </w:t>
       </w:r>
       <w:r>
@@ -5950,6 +6452,7 @@
           <w:lang w:eastAsia="en-GB"/>
           <w14:ligatures w14:val="none"/>
         </w:rPr>
+        <w:lastRenderedPageBreak/>
         <w:drawing>
           <wp:inline distT="0" distB="0" distL="0" distR="0" wp14:anchorId="28E80F52" wp14:editId="73718A65">
             <wp:extent cx="4963439" cy="7010444"/>
@@ -6040,7 +6543,6 @@
           <w:lang w:eastAsia="en-GB"/>
           <w14:ligatures w14:val="none"/>
         </w:rPr>
-        <w:lastRenderedPageBreak/>
         <w:t>Components Design Choice 2</w:t>
       </w:r>
     </w:p>
@@ -6093,6 +6595,7 @@
                 <w:lang w:eastAsia="en-GB"/>
                 <w14:ligatures w14:val="none"/>
               </w:rPr>
+              <w:lastRenderedPageBreak/>
               <w:t>Component</w:t>
             </w:r>
           </w:p>
@@ -6249,7 +6752,7 @@
                 <w:lang w:eastAsia="en-GB"/>
                 <w14:ligatures w14:val="none"/>
               </w:rPr>
-              <w:t>Runs the hierarchical pipeline: prepare data, create shared features, run Level 1, create branches, and evaluate results</w:t>
+              <w:t>Proposed controller for a hierarchical pipeline: would prepare data, create shared features, run Level 1, create branches, and evaluate results</w:t>
             </w:r>
           </w:p>
         </w:tc>
@@ -7063,47 +7566,7 @@
                 <w:lang w:eastAsia="en-GB"/>
                 <w14:ligatures w14:val="none"/>
               </w:rPr>
-              <w:t xml:space="preserve">Extends </w:t>
-            </w:r>
-            <w:proofErr w:type="spellStart"/>
-            <w:r>
-              <w:rPr>
-                <w:rFonts w:ascii="Times New Roman" w:eastAsia="Times New Roman" w:hAnsi="Times New Roman" w:cs="Times New Roman"/>
-                <w:kern w:val="0"/>
-                <w:lang w:eastAsia="en-GB"/>
-                <w14:ligatures w14:val="none"/>
-              </w:rPr>
-              <w:t>RandomForestClassifier</w:t>
-            </w:r>
-            <w:proofErr w:type="spellEnd"/>
-            <w:r>
-              <w:rPr>
-                <w:rFonts w:ascii="Times New Roman" w:eastAsia="Times New Roman" w:hAnsi="Times New Roman" w:cs="Times New Roman"/>
-                <w:kern w:val="0"/>
-                <w:lang w:eastAsia="en-GB"/>
-                <w14:ligatures w14:val="none"/>
-              </w:rPr>
-              <w:t xml:space="preserve"> from </w:t>
-            </w:r>
-            <w:proofErr w:type="spellStart"/>
-            <w:r>
-              <w:rPr>
-                <w:rFonts w:ascii="Times New Roman" w:eastAsia="Times New Roman" w:hAnsi="Times New Roman" w:cs="Times New Roman"/>
-                <w:kern w:val="0"/>
-                <w:lang w:eastAsia="en-GB"/>
-                <w14:ligatures w14:val="none"/>
-              </w:rPr>
-              <w:t>sklearn</w:t>
-            </w:r>
-            <w:proofErr w:type="spellEnd"/>
-            <w:r>
-              <w:rPr>
-                <w:rFonts w:ascii="Times New Roman" w:eastAsia="Times New Roman" w:hAnsi="Times New Roman" w:cs="Times New Roman"/>
-                <w:kern w:val="0"/>
-                <w:lang w:eastAsia="en-GB"/>
-                <w14:ligatures w14:val="none"/>
-              </w:rPr>
-              <w:t>. Used by ChainedMultiOutputModel as the underlying classifier</w:t>
+              <w:t>Classifier implementation that could be instantiated at Level 1, Level 2, or Level 3 in the proposed hierarchy</w:t>
             </w:r>
           </w:p>
         </w:tc>
@@ -7189,47 +7652,7 @@
                 <w:lang w:eastAsia="en-GB"/>
                 <w14:ligatures w14:val="none"/>
               </w:rPr>
-              <w:t xml:space="preserve">Extends </w:t>
-            </w:r>
-            <w:proofErr w:type="spellStart"/>
-            <w:r>
-              <w:rPr>
-                <w:rFonts w:ascii="Times New Roman" w:eastAsia="Times New Roman" w:hAnsi="Times New Roman" w:cs="Times New Roman"/>
-                <w:kern w:val="0"/>
-                <w:lang w:eastAsia="en-GB"/>
-                <w14:ligatures w14:val="none"/>
-              </w:rPr>
-              <w:t>LogisticRegression</w:t>
-            </w:r>
-            <w:proofErr w:type="spellEnd"/>
-            <w:r>
-              <w:rPr>
-                <w:rFonts w:ascii="Times New Roman" w:eastAsia="Times New Roman" w:hAnsi="Times New Roman" w:cs="Times New Roman"/>
-                <w:kern w:val="0"/>
-                <w:lang w:eastAsia="en-GB"/>
-                <w14:ligatures w14:val="none"/>
-              </w:rPr>
-              <w:t xml:space="preserve"> from </w:t>
-            </w:r>
-            <w:proofErr w:type="spellStart"/>
-            <w:r>
-              <w:rPr>
-                <w:rFonts w:ascii="Times New Roman" w:eastAsia="Times New Roman" w:hAnsi="Times New Roman" w:cs="Times New Roman"/>
-                <w:kern w:val="0"/>
-                <w:lang w:eastAsia="en-GB"/>
-                <w14:ligatures w14:val="none"/>
-              </w:rPr>
-              <w:t>sklearn</w:t>
-            </w:r>
-            <w:proofErr w:type="spellEnd"/>
-            <w:r>
-              <w:rPr>
-                <w:rFonts w:ascii="Times New Roman" w:eastAsia="Times New Roman" w:hAnsi="Times New Roman" w:cs="Times New Roman"/>
-                <w:kern w:val="0"/>
-                <w:lang w:eastAsia="en-GB"/>
-                <w14:ligatures w14:val="none"/>
-              </w:rPr>
-              <w:t>. Used by ChainedMultiOutputModel as the underlying classifier</w:t>
+              <w:t>Classifier implementation that could be instantiated at Level 1, Level 2, or Level 3 in the proposed hierarchy</w:t>
             </w:r>
           </w:p>
         </w:tc>
@@ -7315,47 +7738,7 @@
                 <w:lang w:eastAsia="en-GB"/>
                 <w14:ligatures w14:val="none"/>
               </w:rPr>
-              <w:t xml:space="preserve">Extends </w:t>
-            </w:r>
-            <w:proofErr w:type="spellStart"/>
-            <w:r>
-              <w:rPr>
-                <w:rFonts w:ascii="Times New Roman" w:eastAsia="Times New Roman" w:hAnsi="Times New Roman" w:cs="Times New Roman"/>
-                <w:kern w:val="0"/>
-                <w:lang w:eastAsia="en-GB"/>
-                <w14:ligatures w14:val="none"/>
-              </w:rPr>
-              <w:t>MultinomialNB</w:t>
-            </w:r>
-            <w:proofErr w:type="spellEnd"/>
-            <w:r>
-              <w:rPr>
-                <w:rFonts w:ascii="Times New Roman" w:eastAsia="Times New Roman" w:hAnsi="Times New Roman" w:cs="Times New Roman"/>
-                <w:kern w:val="0"/>
-                <w:lang w:eastAsia="en-GB"/>
-                <w14:ligatures w14:val="none"/>
-              </w:rPr>
-              <w:t xml:space="preserve"> from </w:t>
-            </w:r>
-            <w:proofErr w:type="spellStart"/>
-            <w:r>
-              <w:rPr>
-                <w:rFonts w:ascii="Times New Roman" w:eastAsia="Times New Roman" w:hAnsi="Times New Roman" w:cs="Times New Roman"/>
-                <w:kern w:val="0"/>
-                <w:lang w:eastAsia="en-GB"/>
-                <w14:ligatures w14:val="none"/>
-              </w:rPr>
-              <w:t>sklearn</w:t>
-            </w:r>
-            <w:proofErr w:type="spellEnd"/>
-            <w:r>
-              <w:rPr>
-                <w:rFonts w:ascii="Times New Roman" w:eastAsia="Times New Roman" w:hAnsi="Times New Roman" w:cs="Times New Roman"/>
-                <w:kern w:val="0"/>
-                <w:lang w:eastAsia="en-GB"/>
-                <w14:ligatures w14:val="none"/>
-              </w:rPr>
-              <w:t>. Used by ChainedMultiOutputModel as the underlying classifier</w:t>
+              <w:t>Classifier implementation that could be instantiated at Level 1, Level 2, or Level 3 in the proposed hierarchy</w:t>
             </w:r>
           </w:p>
         </w:tc>
@@ -7528,7 +7911,7 @@
                 <w:lang w:eastAsia="en-GB"/>
                 <w14:ligatures w14:val="none"/>
               </w:rPr>
-              <w:t>Smoke test for the base pipeline used by the hierarchical architecture</w:t>
+              <w:t>Base pipeline smoke test reused as a foundation for the proposed hierarchical architecture</w:t>
             </w:r>
           </w:p>
         </w:tc>
@@ -7614,7 +7997,7 @@
                 <w:lang w:eastAsia="en-GB"/>
                 <w14:ligatures w14:val="none"/>
               </w:rPr>
-              <w:t>Returns the appropriate ChainedMultiOutputModel instance based on MODEL_NAME defined in config.py</w:t>
+              <w:t>Proposed factory/selection logic that would choose or create the classifier instance(s) used at each hierarchy level</w:t>
             </w:r>
           </w:p>
         </w:tc>
@@ -7974,14 +8357,28 @@
               <w:rPr>
                 <w:rFonts w:ascii="Times New Roman" w:hAnsi="Times New Roman" w:cs="Times New Roman"/>
               </w:rPr>
-              <w:t>clean_text</w:t>
+              <w:t>clean_</w:t>
+            </w:r>
+            <w:proofErr w:type="gramStart"/>
+            <w:r>
+              <w:rPr>
+                <w:rFonts w:ascii="Times New Roman" w:hAnsi="Times New Roman" w:cs="Times New Roman"/>
+              </w:rPr>
+              <w:t>text</w:t>
             </w:r>
             <w:proofErr w:type="spellEnd"/>
             <w:r>
               <w:rPr>
                 <w:rFonts w:ascii="Times New Roman" w:hAnsi="Times New Roman" w:cs="Times New Roman"/>
               </w:rPr>
-              <w:t>() to normalize raw email text before feature generation.</w:t>
+              <w:t>(</w:t>
+            </w:r>
+            <w:proofErr w:type="gramEnd"/>
+            <w:r>
+              <w:rPr>
+                <w:rFonts w:ascii="Times New Roman" w:hAnsi="Times New Roman" w:cs="Times New Roman"/>
+              </w:rPr>
+              <w:t>) to normalize raw email text before feature generation.</w:t>
             </w:r>
           </w:p>
         </w:tc>
@@ -8081,14 +8478,28 @@
               <w:rPr>
                 <w:rFonts w:ascii="Times New Roman" w:hAnsi="Times New Roman" w:cs="Times New Roman"/>
               </w:rPr>
-              <w:t>vectorize_text</w:t>
+              <w:t>vectorize_</w:t>
+            </w:r>
+            <w:proofErr w:type="gramStart"/>
+            <w:r>
+              <w:rPr>
+                <w:rFonts w:ascii="Times New Roman" w:hAnsi="Times New Roman" w:cs="Times New Roman"/>
+              </w:rPr>
+              <w:t>text</w:t>
             </w:r>
             <w:proofErr w:type="spellEnd"/>
             <w:r>
               <w:rPr>
                 <w:rFonts w:ascii="Times New Roman" w:hAnsi="Times New Roman" w:cs="Times New Roman"/>
               </w:rPr>
-              <w:t>() to create a shared TF-IDF representation for all hierarchy levels.</w:t>
+              <w:t>(</w:t>
+            </w:r>
+            <w:proofErr w:type="gramEnd"/>
+            <w:r>
+              <w:rPr>
+                <w:rFonts w:ascii="Times New Roman" w:hAnsi="Times New Roman" w:cs="Times New Roman"/>
+              </w:rPr>
+              <w:t>) to create a shared TF-IDF representation for all hierarchy levels.</w:t>
             </w:r>
           </w:p>
         </w:tc>

</xml_diff>